<commit_message>
Restructure Requirements with 3 personas and %AI Framework foundation
Major rewrite of the Requirements document:
- Three personas: Developer, AI Hub Admin, End User (System Integrator)
- Section 1.2 explains building on the %AI Framework (Agent, MCP, ToolSet, Tool, Skill, KnowledgeBase)
- Section 1.3 documents framework extensions with bug explanations
- Dedicated sections for Catalogs (Section 3) and LLM Connections (Section 4)
- Expanded Audit and Security Requirements (Section 9)
- Three detailed use cases (Section 5) with tools, skills, and example prompts
- All 15 screenshots embedded throughout the document
- Appendix B maps %AI primitives to application subclasses

Tech Spec and Lessons Learned updated for 3-persona terminology and
framework extension framing.

Co-Authored-By: Claude Opus 4.6 <noreply@anthropic.com>
</commit_message>
<xml_diff>
--- a/docs/02_Technical_Build_Specification.docx
+++ b/docs/02_Technical_Build_Specification.docx
@@ -44,7 +44,7 @@
           <w:color w:val="999999"/>
           <w:sz w:val="20"/>
         </w:rPr>
-        <w:t>Version 1.0 | May 2026 | InterSystems AI Hub</w:t>
+        <w:t>Version 2.0 | May 2026 | InterSystems AI Hub</w:t>
       </w:r>
     </w:p>
     <w:p>
@@ -62,12 +62,17 @@
     </w:p>
     <w:p>
       <w:r>
-        <w:t>This document specifies the components InterSystems must build to deliver a production-grade Agentic Health Interoperability solution. The system is a configuration-driven AI Copilot embedded in IRIS for Health that enables integration engineers to build Productions, create Transformations, and test healthcare messages through natural-language conversation.</w:t>
+        <w:t>This document specifies the components needed to deliver a production-grade Agentic Health Interoperability solution. The system is a configuration-driven AI Copilot embedded in IRIS for Health that enables integration engineers to build Productions, create Transformations, and test healthcare messages through natural-language conversation.</w:t>
       </w:r>
     </w:p>
     <w:p>
       <w:r>
-        <w:t>The solution is built on the IRIS %AI Framework (Agent, MCP, ToolSet, Tool, Skill primitives) and extends it with application-specific infrastructure: a chat UX, an admin UI, vector catalogs, a transformation data atlas, connection management, and audit/security controls.</w:t>
+        <w:t>The solution is built on the IRIS %AI Framework (Agent, MCP, ToolSet, Tool, Skill primitives) and extends it with application-specific infrastructure: a chat UX, an admin UI, vector catalogs, the Transformation and Mapping Catalog, connection management, and audit/security controls.</w:t>
+      </w:r>
+    </w:p>
+    <w:p>
+      <w:r>
+        <w:t>Three personas interact with the system: Developers who build capabilities in code, AI Hub Admins who configure the copilot through the admin UI, and End Users (System Integrators) who use the chatbot to get integration work done.</w:t>
       </w:r>
     </w:p>
     <w:p>
@@ -85,7 +90,7 @@
     </w:p>
     <w:p>
       <w:r>
-        <w:t>A streaming chat interface embedded in the IRIS Management Portal that connects to a %AI.Agent via Server-Sent Events (SSE). The chatbot is the Builder's primary interface for interacting with the agent.</w:t>
+        <w:t>A streaming chat interface embedded in the IRIS Management Portal that connects to a %AI.Agent via Server-Sent Events (SSE). The chatbot is the End User's primary interface for interacting with the agent.</w:t>
       </w:r>
     </w:p>
     <w:p>
@@ -394,7 +399,7 @@
               <w:rPr>
                 <w:sz w:val="20"/>
               </w:rPr>
-              <w:t>Admin UI Agent editor</w:t>
+              <w:t>Admin UI Agent editor (AI Hub Admin)</w:t>
             </w:r>
           </w:p>
         </w:tc>
@@ -657,7 +662,7 @@
     </w:p>
     <w:p>
       <w:r>
-        <w:t>Shipped class defaults and user customizations both survive across IPM upgrades. Override tables (AgentOverride, MCPOverride, ToolSetOverride) store admin UI changes. At build time, the Overlay class merges overrides on top of compiled defaults. 'Reset to defaults' deletes the override row.</w:t>
+        <w:t>Shipped class defaults and user customizations both survive across IPM upgrades. Override tables (AgentOverride, MCPOverride, ToolSetOverride) store admin UI changes made by the AI Hub Admin. At build time, the Overlay class merges overrides on top of compiled defaults. 'Reset to defaults' deletes the override row.</w:t>
       </w:r>
     </w:p>
     <w:p>
@@ -1348,6 +1353,19 @@
       </w:tr>
     </w:tbl>
     <w:p/>
+    <w:p>
+      <w:pPr>
+        <w:pStyle w:val="Heading2"/>
+      </w:pPr>
+      <w:r>
+        <w:t>4.2 Skill Registration</w:t>
+      </w:r>
+    </w:p>
+    <w:p>
+      <w:r>
+        <w:t>Skills extend AgenticInterop.Skill.Base (not %AI.Agent.Skill directly -- see Lessons Learned for the bug that required this extension). At agent build time, SkillLoader discovers all Skill.Base subclasses, instantiates them, and registers them as tools in the agent's tool catalog.</w:t>
+      </w:r>
+    </w:p>
     <w:p>
       <w:r>
         <w:br w:type="page"/>
@@ -2061,7 +2079,7 @@
         <w:pStyle w:val="ListBullet"/>
       </w:pPr>
       <w:r>
-        <w:t>ConfirmationGate: Mutating tools require explicit user approval before execution.</w:t>
+        <w:t>ConfirmationGate: Mutating tools require explicit End User approval before execution.</w:t>
       </w:r>
     </w:p>
     <w:p>
@@ -2069,7 +2087,7 @@
         <w:pStyle w:val="ListBullet"/>
       </w:pPr>
       <w:r>
-        <w:t>ToolFilter: Strips framework waste tools (FileSystem, SQL, ShellTools) from the LLM catalog. Saves ~3K tokens per request.</w:t>
+        <w:t>ToolFilter: Strips framework waste tools (FileSystem, SQL, ShellTools) from the LLM catalog. Saves ~5K tokens per request.</w:t>
       </w:r>
     </w:p>
     <w:p>
@@ -2382,7 +2400,7 @@
         <w:pStyle w:val="Heading1"/>
       </w:pPr>
       <w:r>
-        <w:t>8. Transformation and Mapping Catalog (Transformation Mappings)</w:t>
+        <w:t>8. Transformation and Mapping Catalog</w:t>
       </w:r>
     </w:p>
     <w:p>
@@ -2439,7 +2457,7 @@
           <w:color w:val="666666"/>
           <w:sz w:val="18"/>
         </w:rPr>
-        <w:t>Figure: Transforms tab initial state: format pair selection (Data From / Data To dropdowns) with 1538 pre-computed rows</w:t>
+        <w:t>Figure: Transforms tab initial state: format pair selection with 1,538 pre-computed rows</w:t>
       </w:r>
     </w:p>
     <w:p/>
@@ -2566,7 +2584,7 @@
     </w:p>
     <w:p>
       <w:r>
-        <w:t>A multi-provider LLM connection manager that stores credentials securely and provides health-check (connection test) functionality.</w:t>
+        <w:t>A multi-provider LLM connection manager that stores credentials securely and provides health-check (connection test) functionality. Managed by the AI Hub Admin.</w:t>
       </w:r>
     </w:p>
     <w:p>
@@ -3043,7 +3061,123 @@
         <w:pStyle w:val="Heading2"/>
       </w:pPr>
       <w:r>
-        <w:t>10.1 Audit Log Fields</w:t>
+        <w:t>10.1 Authentication</w:t>
+      </w:r>
+    </w:p>
+    <w:tbl>
+      <w:tblPr>
+        <w:tblStyle w:val="TableGrid"/>
+        <w:tblW w:type="auto" w:w="0"/>
+        <w:jc w:val="center"/>
+        <w:tblLook w:firstColumn="1" w:firstRow="1" w:lastColumn="0" w:lastRow="0" w:noHBand="0" w:noVBand="1" w:val="04A0"/>
+      </w:tblPr>
+      <w:tblGrid>
+        <w:gridCol w:w="4320"/>
+        <w:gridCol w:w="4320"/>
+      </w:tblGrid>
+      <w:tr>
+        <w:tc>
+          <w:tcPr>
+            <w:tcW w:type="dxa" w:w="4320"/>
+            <w:shd w:val="clear" w:color="auto" w:fill="1A1A2E"/>
+          </w:tcPr>
+          <w:p>
+            <w:r>
+              <w:rPr>
+                <w:b/>
+                <w:color w:val="FFFFFF"/>
+                <w:sz w:val="20"/>
+              </w:rPr>
+              <w:t>Method</w:t>
+            </w:r>
+          </w:p>
+        </w:tc>
+        <w:tc>
+          <w:tcPr>
+            <w:tcW w:type="dxa" w:w="4320"/>
+            <w:shd w:val="clear" w:color="auto" w:fill="1A1A2E"/>
+          </w:tcPr>
+          <w:p>
+            <w:r>
+              <w:rPr>
+                <w:b/>
+                <w:color w:val="FFFFFF"/>
+                <w:sz w:val="20"/>
+              </w:rPr>
+              <w:t>Use Case</w:t>
+            </w:r>
+          </w:p>
+        </w:tc>
+      </w:tr>
+      <w:tr>
+        <w:tc>
+          <w:tcPr>
+            <w:tcW w:type="dxa" w:w="4320"/>
+          </w:tcPr>
+          <w:p>
+            <w:r>
+              <w:rPr>
+                <w:sz w:val="20"/>
+              </w:rPr>
+              <w:t>Basic auth</w:t>
+            </w:r>
+          </w:p>
+        </w:tc>
+        <w:tc>
+          <w:tcPr>
+            <w:tcW w:type="dxa" w:w="4320"/>
+          </w:tcPr>
+          <w:p>
+            <w:r>
+              <w:rPr>
+                <w:sz w:val="20"/>
+              </w:rPr>
+              <w:t>Direct admin UI access (standalone mode)</w:t>
+            </w:r>
+          </w:p>
+        </w:tc>
+      </w:tr>
+      <w:tr>
+        <w:tc>
+          <w:tcPr>
+            <w:tcW w:type="dxa" w:w="4320"/>
+          </w:tcPr>
+          <w:p>
+            <w:r>
+              <w:rPr>
+                <w:sz w:val="20"/>
+              </w:rPr>
+              <w:t>JWT Bearer</w:t>
+            </w:r>
+          </w:p>
+        </w:tc>
+        <w:tc>
+          <w:tcPr>
+            <w:tcW w:type="dxa" w:w="4320"/>
+          </w:tcPr>
+          <w:p>
+            <w:r>
+              <w:rPr>
+                <w:sz w:val="20"/>
+              </w:rPr>
+              <w:t>Embedded access from Interop Editor (token passed via postMessage bridge)</w:t>
+            </w:r>
+          </w:p>
+        </w:tc>
+      </w:tr>
+    </w:tbl>
+    <w:p/>
+    <w:p>
+      <w:r>
+        <w:t>All REST endpoints require authentication. No UI element is visible before login.</w:t>
+      </w:r>
+    </w:p>
+    <w:p>
+      <w:pPr>
+        <w:pStyle w:val="Heading2"/>
+      </w:pPr>
+      <w:r>
+        <w:t>10.2 Audit Log Fields</w:t>
       </w:r>
     </w:p>
     <w:tbl>
@@ -3374,6 +3508,30 @@
     </w:tbl>
     <w:p/>
     <w:p>
+      <w:pPr>
+        <w:pStyle w:val="Heading2"/>
+      </w:pPr>
+      <w:r>
+        <w:t>10.3 Security Policies</w:t>
+      </w:r>
+    </w:p>
+    <w:p>
+      <w:pPr>
+        <w:pStyle w:val="ListBullet"/>
+      </w:pPr>
+      <w:r>
+        <w:t>ConfirmationGate: Mutating operations require explicit End User approval.</w:t>
+      </w:r>
+    </w:p>
+    <w:p>
+      <w:pPr>
+        <w:pStyle w:val="ListBullet"/>
+      </w:pPr>
+      <w:r>
+        <w:t>ToolFilter: Strips framework waste tools from the LLM catalog, preventing access to generic system tools.</w:t>
+      </w:r>
+    </w:p>
+    <w:p>
       <w:r>
         <w:br w:type="page"/>
       </w:r>
@@ -3607,7 +3765,7 @@
               <w:rPr>
                 <w:sz w:val="20"/>
               </w:rPr>
-              <w:t>Pre-computed SQL table (1538 rows)</w:t>
+              <w:t>Pre-computed SQL table (1,538 rows)</w:t>
             </w:r>
           </w:p>
         </w:tc>
@@ -4404,7 +4562,7 @@
               <w:rPr>
                 <w:sz w:val="20"/>
               </w:rPr>
-              <w:t>61 ObjectScript classes, 8 web files, 95 commits</w:t>
+              <w:t>61 ObjectScript classes, 8 web files, 100+ commits</w:t>
             </w:r>
           </w:p>
         </w:tc>

</xml_diff>